<commit_message>
Align Product CV with UX UI version
</commit_message>
<xml_diff>
--- a/output/docx/Ekaterina_Melnikova_Product_Designer.docx
+++ b/output/docx/Ekaterina_Melnikova_Product_Designer.docx
@@ -16,11 +16,11 @@
       </w:pPr>
       <w:r>
         <w:rPr>
-          <w:rFonts w:ascii="Aptos" w:hAnsi="Aptos"/>
+          <w:rFonts w:ascii="Arial" w:hAnsi="Arial"/>
           <w:b/>
           <w:i w:val="0"/>
           <w:color w:val="000000"/>
-          <w:sz w:val="24"/>
+          <w:sz w:val="26"/>
         </w:rPr>
         <w:t>Product Designer</w:t>
       </w:r>
@@ -31,11 +31,11 @@
       </w:pPr>
       <w:r>
         <w:rPr>
-          <w:rFonts w:ascii="Aptos" w:hAnsi="Aptos"/>
+          <w:rFonts w:ascii="Arial" w:hAnsi="Arial"/>
           <w:b w:val="0"/>
           <w:i w:val="0"/>
           <w:color w:val="484848"/>
-          <w:sz w:val="19"/>
+          <w:sz w:val="20"/>
         </w:rPr>
         <w:t xml:space="preserve">Novi Sad, Serbia | Residence permit with the right to work | </w:t>
       </w:r>
@@ -44,19 +44,19 @@
           <w:rPr>
             <w:color w:val="0F6F68"/>
             <w:u w:val="single"/>
-            <w:rFonts w:ascii="Aptos" w:hAnsi="Aptos"/>
-            <w:sz w:val="19"/>
+            <w:rFonts w:ascii="Arial" w:hAnsi="Arial"/>
+            <w:sz w:val="20"/>
           </w:rPr>
           <w:t>domofeel@gmail.com</w:t>
         </w:r>
       </w:hyperlink>
       <w:r>
         <w:rPr>
-          <w:rFonts w:ascii="Aptos" w:hAnsi="Aptos"/>
+          <w:rFonts w:ascii="Arial" w:hAnsi="Arial"/>
           <w:b w:val="0"/>
           <w:i w:val="0"/>
           <w:color w:val="484848"/>
-          <w:sz w:val="19"/>
+          <w:sz w:val="20"/>
         </w:rPr>
         <w:t xml:space="preserve"> | </w:t>
       </w:r>
@@ -65,19 +65,19 @@
           <w:rPr>
             <w:color w:val="0F6F68"/>
             <w:u w:val="single"/>
-            <w:rFonts w:ascii="Aptos" w:hAnsi="Aptos"/>
-            <w:sz w:val="19"/>
+            <w:rFonts w:ascii="Arial" w:hAnsi="Arial"/>
+            <w:sz w:val="20"/>
           </w:rPr>
           <w:t>LinkedIn</w:t>
         </w:r>
       </w:hyperlink>
       <w:r>
         <w:rPr>
-          <w:rFonts w:ascii="Aptos" w:hAnsi="Aptos"/>
+          <w:rFonts w:ascii="Arial" w:hAnsi="Arial"/>
           <w:b w:val="0"/>
           <w:i w:val="0"/>
           <w:color w:val="484848"/>
-          <w:sz w:val="19"/>
+          <w:sz w:val="20"/>
         </w:rPr>
         <w:t xml:space="preserve"> | </w:t>
       </w:r>
@@ -86,118 +86,12 @@
           <w:rPr>
             <w:color w:val="0F6F68"/>
             <w:u w:val="single"/>
-            <w:rFonts w:ascii="Aptos" w:hAnsi="Aptos"/>
-            <w:sz w:val="19"/>
+            <w:rFonts w:ascii="Arial" w:hAnsi="Arial"/>
+            <w:sz w:val="20"/>
           </w:rPr>
           <w:t>Portfolio</w:t>
         </w:r>
       </w:hyperlink>
-    </w:p>
-    <w:p>
-      <w:pPr>
-        <w:pStyle w:val="Heading1"/>
-      </w:pPr>
-      <w:r>
-        <w:t>Profile</w:t>
-      </w:r>
-    </w:p>
-    <w:p>
-      <w:pPr>
-        <w:spacing w:after="60"/>
-      </w:pPr>
-      <w:r>
-        <w:rPr>
-          <w:rFonts w:ascii="Aptos" w:hAnsi="Aptos"/>
-          <w:b w:val="0"/>
-          <w:i w:val="0"/>
-          <w:color w:val="000000"/>
-          <w:sz w:val="19"/>
-        </w:rPr>
-        <w:t>Product Designer focused on B2B SaaS, complex admin tools and mobile products. I connect user research, usability testing and product data with clear workflows and scalable interface solutions, taking features from discovery through design, delivery and iteration.</w:t>
-      </w:r>
-    </w:p>
-    <w:p>
-      <w:pPr>
-        <w:pStyle w:val="Heading1"/>
-      </w:pPr>
-      <w:r>
-        <w:t>Core Skills</w:t>
-      </w:r>
-    </w:p>
-    <w:p>
-      <w:pPr>
-        <w:spacing w:after="40"/>
-      </w:pPr>
-      <w:r>
-        <w:rPr>
-          <w:rFonts w:ascii="Aptos" w:hAnsi="Aptos"/>
-          <w:b/>
-          <w:i w:val="0"/>
-          <w:color w:val="000000"/>
-          <w:sz w:val="19"/>
-        </w:rPr>
-        <w:t xml:space="preserve">Product: </w:t>
-      </w:r>
-      <w:r>
-        <w:rPr>
-          <w:rFonts w:ascii="Aptos" w:hAnsi="Aptos"/>
-          <w:b w:val="0"/>
-          <w:i w:val="0"/>
-          <w:color w:val="000000"/>
-          <w:sz w:val="19"/>
-        </w:rPr>
-        <w:t>discovery-to-delivery, product strategy, prioritization, metrics and KPIs, roadmap alignment</w:t>
-      </w:r>
-    </w:p>
-    <w:p>
-      <w:pPr>
-        <w:spacing w:after="40"/>
-      </w:pPr>
-      <w:r>
-        <w:rPr>
-          <w:rFonts w:ascii="Aptos" w:hAnsi="Aptos"/>
-          <w:b/>
-          <w:i w:val="0"/>
-          <w:color w:val="000000"/>
-          <w:sz w:val="19"/>
-        </w:rPr>
-        <w:t xml:space="preserve">Research and UX: </w:t>
-      </w:r>
-      <w:r>
-        <w:rPr>
-          <w:rFonts w:ascii="Aptos" w:hAnsi="Aptos"/>
-          <w:b w:val="0"/>
-          <w:i w:val="0"/>
-          <w:color w:val="000000"/>
-          <w:sz w:val="19"/>
-        </w:rPr>
-        <w:t>user interviews, surveys, usability testing, insight synthesis, information architecture, complex workflows</w:t>
-      </w:r>
-    </w:p>
-    <w:p>
-      <w:pPr>
-        <w:spacing w:after="40"/>
-      </w:pPr>
-      <w:r>
-        <w:rPr>
-          <w:rFonts w:ascii="Aptos" w:hAnsi="Aptos"/>
-          <w:b/>
-          <w:i w:val="0"/>
-          <w:color w:val="000000"/>
-          <w:sz w:val="19"/>
-        </w:rPr>
-        <w:t xml:space="preserve">Design and delivery: </w:t>
-      </w:r>
-      <w:r>
-        <w:rPr>
-          <w:rFonts w:ascii="Aptos" w:hAnsi="Aptos"/>
-          <w:b w:val="0"/>
-          <w:i w:val="0"/>
-          <w:color w:val="000000"/>
-          <w:sz w:val="19"/>
-        </w:rPr>
-        <w:t>user flows, wireframes, prototyping, mobile UI, design systems, Figma, developer handoff, documentation</w:t>
-      </w:r>
     </w:p>
     <w:p>
       <w:pPr>
@@ -216,24 +110,24 @@
       </w:pPr>
       <w:r>
         <w:rPr>
-          <w:rFonts w:ascii="Aptos" w:hAnsi="Aptos"/>
+          <w:rFonts w:ascii="Arial" w:hAnsi="Arial"/>
+          <w:b/>
+          <w:i w:val="0"/>
+          <w:color w:val="000000"/>
+          <w:sz w:val="21"/>
+        </w:rPr>
+        <w:t>Product Designer | Zhelezno</w:t>
+      </w:r>
+      <w:r>
+        <w:rPr>
+          <w:rFonts w:ascii="Arial" w:hAnsi="Arial"/>
           <w:b/>
           <w:i w:val="0"/>
           <w:color w:val="000000"/>
           <w:sz w:val="20"/>
         </w:rPr>
-        <w:t>Senior Product Designer | Zhelezno</w:t>
-      </w:r>
-      <w:r>
-        <w:rPr>
-          <w:rFonts w:ascii="Aptos" w:hAnsi="Aptos"/>
-          <w:b/>
-          <w:i w:val="0"/>
-          <w:color w:val="000000"/>
-          <w:sz w:val="19"/>
-        </w:rPr>
         <w:tab/>
-        <w:t>Jul 2024 - Present</w:t>
+        <w:t>Jan 2022 - Now</w:t>
       </w:r>
     </w:p>
     <w:p>
@@ -243,11 +137,11 @@
       </w:pPr>
       <w:r>
         <w:rPr>
-          <w:rFonts w:ascii="Aptos" w:hAnsi="Aptos"/>
+          <w:rFonts w:ascii="Arial" w:hAnsi="Arial"/>
           <w:b w:val="0"/>
           <w:i w:val="0"/>
           <w:color w:val="000000"/>
-          <w:sz w:val="19"/>
+          <w:sz w:val="20"/>
         </w:rPr>
         <w:t>Led end-to-end product design for B2B dashboards and internal tools, shaping complex workflows into scalable product solutions.</w:t>
       </w:r>
@@ -259,11 +153,11 @@
       </w:pPr>
       <w:r>
         <w:rPr>
-          <w:rFonts w:ascii="Aptos" w:hAnsi="Aptos"/>
+          <w:rFonts w:ascii="Arial" w:hAnsi="Arial"/>
           <w:b w:val="0"/>
           <w:i w:val="0"/>
           <w:color w:val="000000"/>
-          <w:sz w:val="19"/>
+          <w:sz w:val="20"/>
         </w:rPr>
         <w:t>Built and maintained a web and mobile design system, UX patterns and developer documentation, increasing development speed by 50%.</w:t>
       </w:r>
@@ -275,11 +169,11 @@
       </w:pPr>
       <w:r>
         <w:rPr>
-          <w:rFonts w:ascii="Aptos" w:hAnsi="Aptos"/>
+          <w:rFonts w:ascii="Arial" w:hAnsi="Arial"/>
           <w:b w:val="0"/>
           <w:i w:val="0"/>
           <w:color w:val="000000"/>
-          <w:sz w:val="19"/>
+          <w:sz w:val="20"/>
         </w:rPr>
         <w:t>Partnered with Product and Engineering, reducing feature rework by 23% and improving roadmap alignment.</w:t>
       </w:r>
@@ -291,42 +185,13 @@
       </w:pPr>
       <w:r>
         <w:rPr>
-          <w:rFonts w:ascii="Aptos" w:hAnsi="Aptos"/>
+          <w:rFonts w:ascii="Arial" w:hAnsi="Arial"/>
           <w:b w:val="0"/>
-          <w:i w:val="0"/>
-          <w:color w:val="000000"/>
-          <w:sz w:val="19"/>
-        </w:rPr>
-        <w:t>Mentored a junior designer and improved feature delivery time by 14%.</w:t>
-      </w:r>
-    </w:p>
-    <w:p>
-      <w:pPr>
-        <w:pStyle w:val="Role"/>
-        <w:tabs>
-          <w:tab w:pos="10368" w:val="right"/>
-        </w:tabs>
-      </w:pPr>
-      <w:r>
-        <w:rPr>
-          <w:rFonts w:ascii="Aptos" w:hAnsi="Aptos"/>
-          <w:b/>
           <w:i w:val="0"/>
           <w:color w:val="000000"/>
           <w:sz w:val="20"/>
         </w:rPr>
-        <w:t>Middle+ Product Designer | Zhelezno</w:t>
-      </w:r>
-      <w:r>
-        <w:rPr>
-          <w:rFonts w:ascii="Aptos" w:hAnsi="Aptos"/>
-          <w:b/>
-          <w:i w:val="0"/>
-          <w:color w:val="000000"/>
-          <w:sz w:val="19"/>
-        </w:rPr>
-        <w:tab/>
-        <w:t>Jan 2022 - Jul 2024</w:t>
+        <w:t>Mentored a junior designer and improved feature delivery time by 14%.</w:t>
       </w:r>
     </w:p>
     <w:p>
@@ -336,11 +201,11 @@
       </w:pPr>
       <w:r>
         <w:rPr>
-          <w:rFonts w:ascii="Aptos" w:hAnsi="Aptos"/>
+          <w:rFonts w:ascii="Arial" w:hAnsi="Arial"/>
           <w:b w:val="0"/>
           <w:i w:val="0"/>
           <w:color w:val="000000"/>
-          <w:sz w:val="19"/>
+          <w:sz w:val="20"/>
         </w:rPr>
         <w:t>Redesigned complex B2B admin dashboards, increasing daily user adoption by 40%.</w:t>
       </w:r>
@@ -352,11 +217,11 @@
       </w:pPr>
       <w:r>
         <w:rPr>
-          <w:rFonts w:ascii="Aptos" w:hAnsi="Aptos"/>
+          <w:rFonts w:ascii="Arial" w:hAnsi="Arial"/>
           <w:b w:val="0"/>
           <w:i w:val="0"/>
           <w:color w:val="000000"/>
-          <w:sz w:val="19"/>
+          <w:sz w:val="20"/>
         </w:rPr>
         <w:t>Conducted user interviews, surveys and usability testing, increasing B2B retention by 42% within 13 months.</w:t>
       </w:r>
@@ -368,11 +233,11 @@
       </w:pPr>
       <w:r>
         <w:rPr>
-          <w:rFonts w:ascii="Aptos" w:hAnsi="Aptos"/>
+          <w:rFonts w:ascii="Arial" w:hAnsi="Arial"/>
           <w:b w:val="0"/>
           <w:i w:val="0"/>
           <w:color w:val="000000"/>
-          <w:sz w:val="19"/>
+          <w:sz w:val="20"/>
         </w:rPr>
         <w:t>Shipped an employee mobile app used daily by 65% of staff, accelerating task completion by 27%.</w:t>
       </w:r>
@@ -386,21 +251,21 @@
       </w:pPr>
       <w:r>
         <w:rPr>
-          <w:rFonts w:ascii="Aptos" w:hAnsi="Aptos"/>
+          <w:rFonts w:ascii="Arial" w:hAnsi="Arial"/>
           <w:b/>
           <w:i w:val="0"/>
           <w:color w:val="000000"/>
-          <w:sz w:val="20"/>
+          <w:sz w:val="21"/>
         </w:rPr>
         <w:t>UX/UI Designer | ServiceHub</w:t>
       </w:r>
       <w:r>
         <w:rPr>
-          <w:rFonts w:ascii="Aptos" w:hAnsi="Aptos"/>
+          <w:rFonts w:ascii="Arial" w:hAnsi="Arial"/>
           <w:b/>
           <w:i w:val="0"/>
           <w:color w:val="000000"/>
-          <w:sz w:val="19"/>
+          <w:sz w:val="20"/>
         </w:rPr>
         <w:tab/>
         <w:t>Aug 2021 - Dec 2021</w:t>
@@ -413,11 +278,11 @@
       </w:pPr>
       <w:r>
         <w:rPr>
-          <w:rFonts w:ascii="Aptos" w:hAnsi="Aptos"/>
+          <w:rFonts w:ascii="Arial" w:hAnsi="Arial"/>
           <w:b w:val="0"/>
           <w:i w:val="0"/>
           <w:color w:val="000000"/>
-          <w:sz w:val="19"/>
+          <w:sz w:val="20"/>
         </w:rPr>
         <w:t>Improved the usability of the Multifinance fintech SaaS platform through testing and iterative design, increasing employee workflow efficiency by 9%.</w:t>
       </w:r>
@@ -429,11 +294,11 @@
       </w:pPr>
       <w:r>
         <w:rPr>
-          <w:rFonts w:ascii="Aptos" w:hAnsi="Aptos"/>
+          <w:rFonts w:ascii="Arial" w:hAnsi="Arial"/>
           <w:b w:val="0"/>
           <w:i w:val="0"/>
           <w:color w:val="000000"/>
-          <w:sz w:val="19"/>
+          <w:sz w:val="20"/>
         </w:rPr>
         <w:t>Designed a fast-loan banking app from 0 to 1, leading to 30 loan completions within two weeks of launch.</w:t>
       </w:r>
@@ -445,11 +310,11 @@
       </w:pPr>
       <w:r>
         <w:rPr>
-          <w:rFonts w:ascii="Aptos" w:hAnsi="Aptos"/>
+          <w:rFonts w:ascii="Arial" w:hAnsi="Arial"/>
           <w:b w:val="0"/>
           <w:i w:val="0"/>
           <w:color w:val="000000"/>
-          <w:sz w:val="19"/>
+          <w:sz w:val="20"/>
         </w:rPr>
         <w:t>Created branding and a landing page for an IT industry festival, generating 37+ qualified leads.</w:t>
       </w:r>
@@ -463,21 +328,21 @@
       </w:pPr>
       <w:r>
         <w:rPr>
-          <w:rFonts w:ascii="Aptos" w:hAnsi="Aptos"/>
+          <w:rFonts w:ascii="Arial" w:hAnsi="Arial"/>
           <w:b/>
           <w:i w:val="0"/>
           <w:color w:val="000000"/>
-          <w:sz w:val="20"/>
+          <w:sz w:val="21"/>
         </w:rPr>
         <w:t>UX/UI Designer | Apple Concierge</w:t>
       </w:r>
       <w:r>
         <w:rPr>
-          <w:rFonts w:ascii="Aptos" w:hAnsi="Aptos"/>
+          <w:rFonts w:ascii="Arial" w:hAnsi="Arial"/>
           <w:b/>
           <w:i w:val="0"/>
           <w:color w:val="000000"/>
-          <w:sz w:val="19"/>
+          <w:sz w:val="20"/>
         </w:rPr>
         <w:tab/>
         <w:t>Oct 2020 - Dec 2021</w:t>
@@ -490,11 +355,11 @@
       </w:pPr>
       <w:r>
         <w:rPr>
-          <w:rFonts w:ascii="Aptos" w:hAnsi="Aptos"/>
+          <w:rFonts w:ascii="Arial" w:hAnsi="Arial"/>
           <w:b w:val="0"/>
           <w:i w:val="0"/>
           <w:color w:val="000000"/>
-          <w:sz w:val="19"/>
+          <w:sz w:val="20"/>
         </w:rPr>
         <w:t>Designed B2B delivery and food-service apps adopted by Gazprombank, Sberbank and Alfa-Bank, increasing service value by 23%.</w:t>
       </w:r>
@@ -506,11 +371,11 @@
       </w:pPr>
       <w:r>
         <w:rPr>
-          <w:rFonts w:ascii="Aptos" w:hAnsi="Aptos"/>
+          <w:rFonts w:ascii="Arial" w:hAnsi="Arial"/>
           <w:b w:val="0"/>
           <w:i w:val="0"/>
           <w:color w:val="000000"/>
-          <w:sz w:val="19"/>
+          <w:sz w:val="20"/>
         </w:rPr>
         <w:t>Redesigned KPI dashboards and metric-tracking workflows, reducing manager workflow time by 12%.</w:t>
       </w:r>
@@ -522,11 +387,11 @@
       </w:pPr>
       <w:r>
         <w:rPr>
-          <w:rFonts w:ascii="Aptos" w:hAnsi="Aptos"/>
+          <w:rFonts w:ascii="Arial" w:hAnsi="Arial"/>
           <w:b w:val="0"/>
           <w:i w:val="0"/>
           <w:color w:val="000000"/>
-          <w:sz w:val="19"/>
+          <w:sz w:val="20"/>
         </w:rPr>
         <w:t>Led design from user experiments and wireframes to polished UI and interactive prototypes, improving mobile app user flows by 19%.</w:t>
       </w:r>
@@ -540,21 +405,21 @@
       </w:pPr>
       <w:r>
         <w:rPr>
-          <w:rFonts w:ascii="Aptos" w:hAnsi="Aptos"/>
+          <w:rFonts w:ascii="Arial" w:hAnsi="Arial"/>
           <w:b/>
           <w:i w:val="0"/>
           <w:color w:val="000000"/>
-          <w:sz w:val="20"/>
+          <w:sz w:val="21"/>
         </w:rPr>
         <w:t>Web Designer | CTC Media</w:t>
       </w:r>
       <w:r>
         <w:rPr>
-          <w:rFonts w:ascii="Aptos" w:hAnsi="Aptos"/>
+          <w:rFonts w:ascii="Arial" w:hAnsi="Arial"/>
           <w:b/>
           <w:i w:val="0"/>
           <w:color w:val="000000"/>
-          <w:sz w:val="19"/>
+          <w:sz w:val="20"/>
         </w:rPr>
         <w:tab/>
         <w:t>May 2020 - Sep 2020</w:t>
@@ -567,11 +432,11 @@
       </w:pPr>
       <w:r>
         <w:rPr>
-          <w:rFonts w:ascii="Aptos" w:hAnsi="Aptos"/>
+          <w:rFonts w:ascii="Arial" w:hAnsi="Arial"/>
           <w:b w:val="0"/>
           <w:i w:val="0"/>
           <w:color w:val="000000"/>
-          <w:sz w:val="19"/>
+          <w:sz w:val="20"/>
         </w:rPr>
         <w:t>Redesigned key B2C and B2B marketplace flows, improving user journeys and supporting adoption among 4K+ active users.</w:t>
       </w:r>
@@ -587,13 +452,36 @@
     <w:p>
       <w:r>
         <w:rPr>
-          <w:rFonts w:ascii="Aptos" w:hAnsi="Aptos"/>
+          <w:rFonts w:ascii="Arial" w:hAnsi="Arial"/>
           <w:b w:val="0"/>
           <w:i w:val="0"/>
           <w:color w:val="000000"/>
-          <w:sz w:val="19"/>
+          <w:sz w:val="20"/>
         </w:rPr>
         <w:t>Baltic International Academy, Riga | Master's degree, Marketing in Leisure Industry</w:t>
+      </w:r>
+    </w:p>
+    <w:p>
+      <w:pPr>
+        <w:pStyle w:val="Heading1"/>
+      </w:pPr>
+      <w:r>
+        <w:t>Skills</w:t>
+      </w:r>
+    </w:p>
+    <w:p>
+      <w:pPr>
+        <w:spacing w:after="60"/>
+      </w:pPr>
+      <w:r>
+        <w:rPr>
+          <w:rFonts w:ascii="Arial" w:hAnsi="Arial"/>
+          <w:b w:val="0"/>
+          <w:i w:val="0"/>
+          <w:color w:val="000000"/>
+          <w:sz w:val="20"/>
+        </w:rPr>
+        <w:t>Product Design, User Research, User Interviews, Usability Testing, Information Architecture, Interaction Design, User Flows, Wireframing, Prototyping, UI Design, Design Systems, Product Metrics, A/B Testing, Feature Prioritization, Developer Handoff, Stakeholder Alignment, Figma, FigJam, ProtoPie, Adobe Photoshop, Adobe Illustrator, ChatGPT, Claude, Codex.</w:t>
       </w:r>
     </w:p>
     <w:sectPr>
@@ -970,12 +858,12 @@
     <w:qFormat/>
     <w:rsid w:val="00FC693F"/>
     <w:pPr>
-      <w:spacing w:after="48" w:line="250" w:lineRule="auto"/>
-    </w:pPr>
-    <w:rPr>
-      <w:rFonts w:ascii="Aptos" w:hAnsi="Aptos"/>
+      <w:spacing w:after="60" w:line="254" w:lineRule="auto"/>
+    </w:pPr>
+    <w:rPr>
+      <w:rFonts w:ascii="Arial" w:hAnsi="Arial"/>
       <w:color w:val="000000"/>
-      <w:sz w:val="19"/>
+      <w:sz w:val="20"/>
     </w:rPr>
   </w:style>
   <w:style w:type="paragraph" w:styleId="Header">
@@ -992,6 +880,9 @@
       </w:tabs>
       <w:spacing w:after="0" w:line="240" w:lineRule="auto"/>
     </w:pPr>
+    <w:rPr>
+      <w:rFonts w:ascii="Arial" w:hAnsi="Arial"/>
+    </w:rPr>
   </w:style>
   <w:style w:type="character" w:customStyle="1" w:styleId="HeaderChar">
     <w:name w:val="Header Char"/>
@@ -999,6 +890,9 @@
     <w:link w:val="Header"/>
     <w:uiPriority w:val="99"/>
     <w:rsid w:val="00E618BF"/>
+    <w:rPr>
+      <w:rFonts w:ascii="Arial" w:hAnsi="Arial"/>
+    </w:rPr>
   </w:style>
   <w:style w:type="paragraph" w:styleId="Footer">
     <w:name w:val="footer"/>
@@ -1014,6 +908,9 @@
       </w:tabs>
       <w:spacing w:after="0" w:line="240" w:lineRule="auto"/>
     </w:pPr>
+    <w:rPr>
+      <w:rFonts w:ascii="Arial" w:hAnsi="Arial"/>
+    </w:rPr>
   </w:style>
   <w:style w:type="character" w:customStyle="1" w:styleId="FooterChar">
     <w:name w:val="Footer Char"/>
@@ -1021,6 +918,9 @@
     <w:link w:val="Footer"/>
     <w:uiPriority w:val="99"/>
     <w:rsid w:val="00E618BF"/>
+    <w:rPr>
+      <w:rFonts w:ascii="Arial" w:hAnsi="Arial"/>
+    </w:rPr>
   </w:style>
   <w:style w:type="paragraph" w:styleId="Heading1">
     <w:name w:val="heading 1"/>
@@ -1033,15 +933,15 @@
     <w:pPr>
       <w:keepNext/>
       <w:keepLines/>
-      <w:spacing w:before="160" w:after="60"/>
+      <w:spacing w:before="180" w:after="80"/>
       <w:outlineLvl w:val="0"/>
     </w:pPr>
     <w:rPr>
-      <w:rFonts w:asciiTheme="majorHAnsi" w:eastAsiaTheme="majorEastAsia" w:hAnsiTheme="majorHAnsi" w:cstheme="majorBidi" w:ascii="Aptos" w:hAnsi="Aptos"/>
+      <w:rFonts w:asciiTheme="majorHAnsi" w:eastAsiaTheme="majorEastAsia" w:hAnsiTheme="majorHAnsi" w:cstheme="majorBidi" w:ascii="Arial" w:hAnsi="Arial"/>
       <w:b/>
       <w:bCs/>
       <w:color w:val="000000"/>
-      <w:sz w:val="23"/>
+      <w:sz w:val="24"/>
       <w:szCs w:val="28"/>
     </w:rPr>
   </w:style>
@@ -1061,7 +961,7 @@
       <w:outlineLvl w:val="1"/>
     </w:pPr>
     <w:rPr>
-      <w:rFonts w:asciiTheme="majorHAnsi" w:eastAsiaTheme="majorEastAsia" w:hAnsiTheme="majorHAnsi" w:cstheme="majorBidi" w:ascii="Aptos" w:hAnsi="Aptos"/>
+      <w:rFonts w:asciiTheme="majorHAnsi" w:eastAsiaTheme="majorEastAsia" w:hAnsiTheme="majorHAnsi" w:cstheme="majorBidi" w:ascii="Arial" w:hAnsi="Arial"/>
       <w:b/>
       <w:bCs/>
       <w:color w:val="000000"/>
@@ -1085,7 +985,7 @@
       <w:outlineLvl w:val="2"/>
     </w:pPr>
     <w:rPr>
-      <w:rFonts w:asciiTheme="majorHAnsi" w:eastAsiaTheme="majorEastAsia" w:hAnsiTheme="majorHAnsi" w:cstheme="majorBidi"/>
+      <w:rFonts w:asciiTheme="majorHAnsi" w:eastAsiaTheme="majorEastAsia" w:hAnsiTheme="majorHAnsi" w:cstheme="majorBidi" w:ascii="Arial" w:hAnsi="Arial"/>
       <w:b/>
       <w:bCs/>
       <w:color w:val="4F81BD" w:themeColor="accent1"/>
@@ -1108,7 +1008,7 @@
       <w:outlineLvl w:val="3"/>
     </w:pPr>
     <w:rPr>
-      <w:rFonts w:asciiTheme="majorHAnsi" w:eastAsiaTheme="majorEastAsia" w:hAnsiTheme="majorHAnsi" w:cstheme="majorBidi"/>
+      <w:rFonts w:asciiTheme="majorHAnsi" w:eastAsiaTheme="majorEastAsia" w:hAnsiTheme="majorHAnsi" w:cstheme="majorBidi" w:ascii="Arial" w:hAnsi="Arial"/>
       <w:b/>
       <w:bCs/>
       <w:i/>
@@ -1133,7 +1033,7 @@
       <w:outlineLvl w:val="4"/>
     </w:pPr>
     <w:rPr>
-      <w:rFonts w:asciiTheme="majorHAnsi" w:eastAsiaTheme="majorEastAsia" w:hAnsiTheme="majorHAnsi" w:cstheme="majorBidi"/>
+      <w:rFonts w:asciiTheme="majorHAnsi" w:eastAsiaTheme="majorEastAsia" w:hAnsiTheme="majorHAnsi" w:cstheme="majorBidi" w:ascii="Arial" w:hAnsi="Arial"/>
       <w:color w:val="243F60" w:themeColor="accent1" w:themeShade="7F"/>
     </w:rPr>
   </w:style>
@@ -1154,7 +1054,7 @@
       <w:outlineLvl w:val="5"/>
     </w:pPr>
     <w:rPr>
-      <w:rFonts w:asciiTheme="majorHAnsi" w:eastAsiaTheme="majorEastAsia" w:hAnsiTheme="majorHAnsi" w:cstheme="majorBidi"/>
+      <w:rFonts w:asciiTheme="majorHAnsi" w:eastAsiaTheme="majorEastAsia" w:hAnsiTheme="majorHAnsi" w:cstheme="majorBidi" w:ascii="Arial" w:hAnsi="Arial"/>
       <w:i/>
       <w:iCs/>
       <w:color w:val="243F60" w:themeColor="accent1" w:themeShade="7F"/>
@@ -1177,7 +1077,7 @@
       <w:outlineLvl w:val="6"/>
     </w:pPr>
     <w:rPr>
-      <w:rFonts w:asciiTheme="majorHAnsi" w:eastAsiaTheme="majorEastAsia" w:hAnsiTheme="majorHAnsi" w:cstheme="majorBidi"/>
+      <w:rFonts w:asciiTheme="majorHAnsi" w:eastAsiaTheme="majorEastAsia" w:hAnsiTheme="majorHAnsi" w:cstheme="majorBidi" w:ascii="Arial" w:hAnsi="Arial"/>
       <w:i/>
       <w:iCs/>
       <w:color w:val="404040" w:themeColor="text1" w:themeTint="BF"/>
@@ -1200,7 +1100,7 @@
       <w:outlineLvl w:val="7"/>
     </w:pPr>
     <w:rPr>
-      <w:rFonts w:asciiTheme="majorHAnsi" w:eastAsiaTheme="majorEastAsia" w:hAnsiTheme="majorHAnsi" w:cstheme="majorBidi"/>
+      <w:rFonts w:asciiTheme="majorHAnsi" w:eastAsiaTheme="majorEastAsia" w:hAnsiTheme="majorHAnsi" w:cstheme="majorBidi" w:ascii="Arial" w:hAnsi="Arial"/>
       <w:color w:val="4F81BD" w:themeColor="accent1"/>
       <w:sz w:val="20"/>
       <w:szCs w:val="20"/>
@@ -1223,7 +1123,7 @@
       <w:outlineLvl w:val="8"/>
     </w:pPr>
     <w:rPr>
-      <w:rFonts w:asciiTheme="majorHAnsi" w:eastAsiaTheme="majorEastAsia" w:hAnsiTheme="majorHAnsi" w:cstheme="majorBidi"/>
+      <w:rFonts w:asciiTheme="majorHAnsi" w:eastAsiaTheme="majorEastAsia" w:hAnsiTheme="majorHAnsi" w:cstheme="majorBidi" w:ascii="Arial" w:hAnsi="Arial"/>
       <w:i/>
       <w:iCs/>
       <w:color w:val="404040" w:themeColor="text1" w:themeTint="BF"/>
@@ -1236,12 +1136,18 @@
     <w:uiPriority w:val="1"/>
     <w:semiHidden/>
     <w:unhideWhenUsed/>
+    <w:rPr>
+      <w:rFonts w:ascii="Arial" w:hAnsi="Arial"/>
+    </w:rPr>
   </w:style>
   <w:style w:type="table" w:default="1" w:styleId="TableNormal">
     <w:name w:val="Normal Table"/>
     <w:uiPriority w:val="99"/>
     <w:semiHidden/>
     <w:unhideWhenUsed/>
+    <w:rPr>
+      <w:rFonts w:ascii="Arial" w:hAnsi="Arial"/>
+    </w:rPr>
     <w:tblPr>
       <w:tblInd w:w="0" w:type="dxa"/>
       <w:tblCellMar>
@@ -1266,6 +1172,9 @@
     <w:pPr>
       <w:spacing w:after="0" w:line="240" w:lineRule="auto"/>
     </w:pPr>
+    <w:rPr>
+      <w:rFonts w:ascii="Arial" w:hAnsi="Arial"/>
+    </w:rPr>
   </w:style>
   <w:style w:type="character" w:customStyle="1" w:styleId="Heading1Char">
     <w:name w:val="Heading 1 Char"/>
@@ -1274,7 +1183,7 @@
     <w:uiPriority w:val="9"/>
     <w:rsid w:val="00FC693F"/>
     <w:rPr>
-      <w:rFonts w:asciiTheme="majorHAnsi" w:eastAsiaTheme="majorEastAsia" w:hAnsiTheme="majorHAnsi" w:cstheme="majorBidi"/>
+      <w:rFonts w:asciiTheme="majorHAnsi" w:eastAsiaTheme="majorEastAsia" w:hAnsiTheme="majorHAnsi" w:cstheme="majorBidi" w:ascii="Arial" w:hAnsi="Arial"/>
       <w:b/>
       <w:bCs/>
       <w:color w:val="365F91" w:themeColor="accent1" w:themeShade="BF"/>
@@ -1289,7 +1198,7 @@
     <w:uiPriority w:val="9"/>
     <w:rsid w:val="00FC693F"/>
     <w:rPr>
-      <w:rFonts w:asciiTheme="majorHAnsi" w:eastAsiaTheme="majorEastAsia" w:hAnsiTheme="majorHAnsi" w:cstheme="majorBidi"/>
+      <w:rFonts w:asciiTheme="majorHAnsi" w:eastAsiaTheme="majorEastAsia" w:hAnsiTheme="majorHAnsi" w:cstheme="majorBidi" w:ascii="Arial" w:hAnsi="Arial"/>
       <w:b/>
       <w:bCs/>
       <w:color w:val="4F81BD" w:themeColor="accent1"/>
@@ -1304,7 +1213,7 @@
     <w:uiPriority w:val="9"/>
     <w:rsid w:val="00FC693F"/>
     <w:rPr>
-      <w:rFonts w:asciiTheme="majorHAnsi" w:eastAsiaTheme="majorEastAsia" w:hAnsiTheme="majorHAnsi" w:cstheme="majorBidi"/>
+      <w:rFonts w:asciiTheme="majorHAnsi" w:eastAsiaTheme="majorEastAsia" w:hAnsiTheme="majorHAnsi" w:cstheme="majorBidi" w:ascii="Arial" w:hAnsi="Arial"/>
       <w:b/>
       <w:bCs/>
       <w:color w:val="4F81BD" w:themeColor="accent1"/>
@@ -1319,16 +1228,16 @@
     <w:qFormat/>
     <w:rsid w:val="00FC693F"/>
     <w:pPr>
-      <w:spacing w:after="40" w:line="240" w:lineRule="auto"/>
+      <w:spacing w:after="60" w:line="240" w:lineRule="auto"/>
       <w:contextualSpacing/>
     </w:pPr>
     <w:rPr>
-      <w:rFonts w:asciiTheme="majorHAnsi" w:eastAsiaTheme="majorEastAsia" w:hAnsiTheme="majorHAnsi" w:cstheme="majorBidi" w:ascii="Aptos" w:hAnsi="Aptos"/>
+      <w:rFonts w:asciiTheme="majorHAnsi" w:eastAsiaTheme="majorEastAsia" w:hAnsiTheme="majorHAnsi" w:cstheme="majorBidi" w:ascii="Arial" w:hAnsi="Arial"/>
       <w:b/>
       <w:color w:val="000000"/>
       <w:spacing w:val="5"/>
       <w:kern w:val="28"/>
-      <w:sz w:val="50"/>
+      <w:sz w:val="54"/>
       <w:szCs w:val="52"/>
     </w:rPr>
   </w:style>
@@ -1339,7 +1248,7 @@
     <w:uiPriority w:val="10"/>
     <w:rsid w:val="00FC693F"/>
     <w:rPr>
-      <w:rFonts w:asciiTheme="majorHAnsi" w:eastAsiaTheme="majorEastAsia" w:hAnsiTheme="majorHAnsi" w:cstheme="majorBidi"/>
+      <w:rFonts w:asciiTheme="majorHAnsi" w:eastAsiaTheme="majorEastAsia" w:hAnsiTheme="majorHAnsi" w:cstheme="majorBidi" w:ascii="Arial" w:hAnsi="Arial"/>
       <w:color w:val="17365D" w:themeColor="text2" w:themeShade="BF"/>
       <w:spacing w:val="5"/>
       <w:kern w:val="28"/>
@@ -1361,7 +1270,7 @@
       </w:numPr>
     </w:pPr>
     <w:rPr>
-      <w:rFonts w:asciiTheme="majorHAnsi" w:eastAsiaTheme="majorEastAsia" w:hAnsiTheme="majorHAnsi" w:cstheme="majorBidi"/>
+      <w:rFonts w:asciiTheme="majorHAnsi" w:eastAsiaTheme="majorEastAsia" w:hAnsiTheme="majorHAnsi" w:cstheme="majorBidi" w:ascii="Arial" w:hAnsi="Arial"/>
       <w:i/>
       <w:iCs/>
       <w:color w:val="4F81BD" w:themeColor="accent1"/>
@@ -1377,7 +1286,7 @@
     <w:uiPriority w:val="11"/>
     <w:rsid w:val="00FC693F"/>
     <w:rPr>
-      <w:rFonts w:asciiTheme="majorHAnsi" w:eastAsiaTheme="majorEastAsia" w:hAnsiTheme="majorHAnsi" w:cstheme="majorBidi"/>
+      <w:rFonts w:asciiTheme="majorHAnsi" w:eastAsiaTheme="majorEastAsia" w:hAnsiTheme="majorHAnsi" w:cstheme="majorBidi" w:ascii="Arial" w:hAnsi="Arial"/>
       <w:i/>
       <w:iCs/>
       <w:color w:val="4F81BD" w:themeColor="accent1"/>
@@ -1396,6 +1305,9 @@
       <w:ind w:left="720"/>
       <w:contextualSpacing/>
     </w:pPr>
+    <w:rPr>
+      <w:rFonts w:ascii="Arial" w:hAnsi="Arial"/>
+    </w:rPr>
   </w:style>
   <w:style w:type="paragraph" w:styleId="BodyText">
     <w:name w:val="Body Text"/>
@@ -1407,6 +1319,9 @@
     <w:pPr>
       <w:spacing w:after="120"/>
     </w:pPr>
+    <w:rPr>
+      <w:rFonts w:ascii="Arial" w:hAnsi="Arial"/>
+    </w:rPr>
   </w:style>
   <w:style w:type="character" w:customStyle="1" w:styleId="BodyTextChar">
     <w:name w:val="Body Text Char"/>
@@ -1414,6 +1329,9 @@
     <w:link w:val="BodyText"/>
     <w:uiPriority w:val="99"/>
     <w:rsid w:val="00AA1D8D"/>
+    <w:rPr>
+      <w:rFonts w:ascii="Arial" w:hAnsi="Arial"/>
+    </w:rPr>
   </w:style>
   <w:style w:type="paragraph" w:styleId="BodyText2">
     <w:name w:val="Body Text 2"/>
@@ -1425,6 +1343,9 @@
     <w:pPr>
       <w:spacing w:after="120" w:line="480" w:lineRule="auto"/>
     </w:pPr>
+    <w:rPr>
+      <w:rFonts w:ascii="Arial" w:hAnsi="Arial"/>
+    </w:rPr>
   </w:style>
   <w:style w:type="character" w:customStyle="1" w:styleId="BodyText2Char">
     <w:name w:val="Body Text 2 Char"/>
@@ -1432,6 +1353,9 @@
     <w:link w:val="BodyText2"/>
     <w:uiPriority w:val="99"/>
     <w:rsid w:val="00AA1D8D"/>
+    <w:rPr>
+      <w:rFonts w:ascii="Arial" w:hAnsi="Arial"/>
+    </w:rPr>
   </w:style>
   <w:style w:type="paragraph" w:styleId="BodyText3">
     <w:name w:val="Body Text 3"/>
@@ -1444,6 +1368,7 @@
       <w:spacing w:after="120"/>
     </w:pPr>
     <w:rPr>
+      <w:rFonts w:ascii="Arial" w:hAnsi="Arial"/>
       <w:sz w:val="16"/>
       <w:szCs w:val="16"/>
     </w:rPr>
@@ -1455,6 +1380,7 @@
     <w:uiPriority w:val="99"/>
     <w:rsid w:val="00AA1D8D"/>
     <w:rPr>
+      <w:rFonts w:ascii="Arial" w:hAnsi="Arial"/>
       <w:sz w:val="16"/>
       <w:szCs w:val="16"/>
     </w:rPr>
@@ -1469,6 +1395,9 @@
       <w:ind w:left="360" w:hanging="360"/>
       <w:contextualSpacing/>
     </w:pPr>
+    <w:rPr>
+      <w:rFonts w:ascii="Arial" w:hAnsi="Arial"/>
+    </w:rPr>
   </w:style>
   <w:style w:type="paragraph" w:styleId="List2">
     <w:name w:val="List 2"/>
@@ -1480,6 +1409,9 @@
       <w:ind w:left="720" w:hanging="360"/>
       <w:contextualSpacing/>
     </w:pPr>
+    <w:rPr>
+      <w:rFonts w:ascii="Arial" w:hAnsi="Arial"/>
+    </w:rPr>
   </w:style>
   <w:style w:type="paragraph" w:styleId="List3">
     <w:name w:val="List 3"/>
@@ -1491,6 +1423,9 @@
       <w:ind w:left="1080" w:hanging="360"/>
       <w:contextualSpacing/>
     </w:pPr>
+    <w:rPr>
+      <w:rFonts w:ascii="Arial" w:hAnsi="Arial"/>
+    </w:rPr>
   </w:style>
   <w:style w:type="paragraph" w:styleId="ListBullet">
     <w:name w:val="List Bullet"/>
@@ -1502,14 +1437,14 @@
       <w:numPr>
         <w:numId w:val="1"/>
       </w:numPr>
-      <w:spacing w:after="32" w:line="245" w:lineRule="auto"/>
+      <w:spacing w:after="44" w:line="250" w:lineRule="auto"/>
       <w:ind w:left="288" w:hanging="187"/>
       <w:contextualSpacing/>
     </w:pPr>
     <w:rPr>
-      <w:rFonts w:ascii="Aptos" w:hAnsi="Aptos"/>
+      <w:rFonts w:ascii="Arial" w:hAnsi="Arial"/>
       <w:color w:val="000000"/>
-      <w:sz w:val="19"/>
+      <w:sz w:val="20"/>
     </w:rPr>
   </w:style>
   <w:style w:type="paragraph" w:styleId="ListBullet2">
@@ -1524,6 +1459,9 @@
       </w:numPr>
       <w:contextualSpacing/>
     </w:pPr>
+    <w:rPr>
+      <w:rFonts w:ascii="Arial" w:hAnsi="Arial"/>
+    </w:rPr>
   </w:style>
   <w:style w:type="paragraph" w:styleId="ListBullet3">
     <w:name w:val="List Bullet 3"/>
@@ -1537,6 +1475,9 @@
       </w:numPr>
       <w:contextualSpacing/>
     </w:pPr>
+    <w:rPr>
+      <w:rFonts w:ascii="Arial" w:hAnsi="Arial"/>
+    </w:rPr>
   </w:style>
   <w:style w:type="paragraph" w:styleId="ListNumber">
     <w:name w:val="List Number"/>
@@ -1550,6 +1491,9 @@
       </w:numPr>
       <w:contextualSpacing/>
     </w:pPr>
+    <w:rPr>
+      <w:rFonts w:ascii="Arial" w:hAnsi="Arial"/>
+    </w:rPr>
   </w:style>
   <w:style w:type="paragraph" w:styleId="ListNumber2">
     <w:name w:val="List Number 2"/>
@@ -1563,6 +1507,9 @@
       </w:numPr>
       <w:contextualSpacing/>
     </w:pPr>
+    <w:rPr>
+      <w:rFonts w:ascii="Arial" w:hAnsi="Arial"/>
+    </w:rPr>
   </w:style>
   <w:style w:type="paragraph" w:styleId="ListNumber3">
     <w:name w:val="List Number 3"/>
@@ -1576,6 +1523,9 @@
       </w:numPr>
       <w:contextualSpacing/>
     </w:pPr>
+    <w:rPr>
+      <w:rFonts w:ascii="Arial" w:hAnsi="Arial"/>
+    </w:rPr>
   </w:style>
   <w:style w:type="paragraph" w:styleId="ListContinue">
     <w:name w:val="List Continue"/>
@@ -1588,6 +1538,9 @@
       <w:ind w:left="360"/>
       <w:contextualSpacing/>
     </w:pPr>
+    <w:rPr>
+      <w:rFonts w:ascii="Arial" w:hAnsi="Arial"/>
+    </w:rPr>
   </w:style>
   <w:style w:type="paragraph" w:styleId="ListContinue2">
     <w:name w:val="List Continue 2"/>
@@ -1600,6 +1553,9 @@
       <w:ind w:left="720"/>
       <w:contextualSpacing/>
     </w:pPr>
+    <w:rPr>
+      <w:rFonts w:ascii="Arial" w:hAnsi="Arial"/>
+    </w:rPr>
   </w:style>
   <w:style w:type="paragraph" w:styleId="ListContinue3">
     <w:name w:val="List Continue 3"/>
@@ -1612,6 +1568,9 @@
       <w:ind w:left="1080"/>
       <w:contextualSpacing/>
     </w:pPr>
+    <w:rPr>
+      <w:rFonts w:ascii="Arial" w:hAnsi="Arial"/>
+    </w:rPr>
   </w:style>
   <w:style w:type="paragraph" w:styleId="MacroText">
     <w:name w:val="macro"/>
@@ -1631,7 +1590,7 @@
       </w:tabs>
     </w:pPr>
     <w:rPr>
-      <w:rFonts w:ascii="Courier" w:hAnsi="Courier"/>
+      <w:rFonts w:ascii="Arial" w:hAnsi="Arial"/>
       <w:sz w:val="20"/>
       <w:szCs w:val="20"/>
     </w:rPr>
@@ -1643,7 +1602,7 @@
     <w:uiPriority w:val="99"/>
     <w:rsid w:val="0029639D"/>
     <w:rPr>
-      <w:rFonts w:ascii="Courier" w:hAnsi="Courier"/>
+      <w:rFonts w:ascii="Arial" w:hAnsi="Arial"/>
       <w:sz w:val="20"/>
       <w:szCs w:val="20"/>
     </w:rPr>
@@ -1657,6 +1616,7 @@
     <w:qFormat/>
     <w:rsid w:val="00FC693F"/>
     <w:rPr>
+      <w:rFonts w:ascii="Arial" w:hAnsi="Arial"/>
       <w:i/>
       <w:iCs/>
       <w:color w:val="000000" w:themeColor="text1"/>
@@ -1669,6 +1629,7 @@
     <w:uiPriority w:val="29"/>
     <w:rsid w:val="00FC693F"/>
     <w:rPr>
+      <w:rFonts w:ascii="Arial" w:hAnsi="Arial"/>
       <w:i/>
       <w:iCs/>
       <w:color w:val="000000" w:themeColor="text1"/>
@@ -1682,7 +1643,7 @@
     <w:semiHidden/>
     <w:rsid w:val="00FC693F"/>
     <w:rPr>
-      <w:rFonts w:asciiTheme="majorHAnsi" w:eastAsiaTheme="majorEastAsia" w:hAnsiTheme="majorHAnsi" w:cstheme="majorBidi"/>
+      <w:rFonts w:asciiTheme="majorHAnsi" w:eastAsiaTheme="majorEastAsia" w:hAnsiTheme="majorHAnsi" w:cstheme="majorBidi" w:ascii="Arial" w:hAnsi="Arial"/>
       <w:b/>
       <w:bCs/>
       <w:i/>
@@ -1698,7 +1659,7 @@
     <w:semiHidden/>
     <w:rsid w:val="00FC693F"/>
     <w:rPr>
-      <w:rFonts w:asciiTheme="majorHAnsi" w:eastAsiaTheme="majorEastAsia" w:hAnsiTheme="majorHAnsi" w:cstheme="majorBidi"/>
+      <w:rFonts w:asciiTheme="majorHAnsi" w:eastAsiaTheme="majorEastAsia" w:hAnsiTheme="majorHAnsi" w:cstheme="majorBidi" w:ascii="Arial" w:hAnsi="Arial"/>
       <w:color w:val="243F60" w:themeColor="accent1" w:themeShade="7F"/>
     </w:rPr>
   </w:style>
@@ -1710,7 +1671,7 @@
     <w:semiHidden/>
     <w:rsid w:val="00FC693F"/>
     <w:rPr>
-      <w:rFonts w:asciiTheme="majorHAnsi" w:eastAsiaTheme="majorEastAsia" w:hAnsiTheme="majorHAnsi" w:cstheme="majorBidi"/>
+      <w:rFonts w:asciiTheme="majorHAnsi" w:eastAsiaTheme="majorEastAsia" w:hAnsiTheme="majorHAnsi" w:cstheme="majorBidi" w:ascii="Arial" w:hAnsi="Arial"/>
       <w:i/>
       <w:iCs/>
       <w:color w:val="243F60" w:themeColor="accent1" w:themeShade="7F"/>
@@ -1724,7 +1685,7 @@
     <w:semiHidden/>
     <w:rsid w:val="00FC693F"/>
     <w:rPr>
-      <w:rFonts w:asciiTheme="majorHAnsi" w:eastAsiaTheme="majorEastAsia" w:hAnsiTheme="majorHAnsi" w:cstheme="majorBidi"/>
+      <w:rFonts w:asciiTheme="majorHAnsi" w:eastAsiaTheme="majorEastAsia" w:hAnsiTheme="majorHAnsi" w:cstheme="majorBidi" w:ascii="Arial" w:hAnsi="Arial"/>
       <w:i/>
       <w:iCs/>
       <w:color w:val="404040" w:themeColor="text1" w:themeTint="BF"/>
@@ -1738,7 +1699,7 @@
     <w:semiHidden/>
     <w:rsid w:val="00FC693F"/>
     <w:rPr>
-      <w:rFonts w:asciiTheme="majorHAnsi" w:eastAsiaTheme="majorEastAsia" w:hAnsiTheme="majorHAnsi" w:cstheme="majorBidi"/>
+      <w:rFonts w:asciiTheme="majorHAnsi" w:eastAsiaTheme="majorEastAsia" w:hAnsiTheme="majorHAnsi" w:cstheme="majorBidi" w:ascii="Arial" w:hAnsi="Arial"/>
       <w:color w:val="4F81BD" w:themeColor="accent1"/>
       <w:sz w:val="20"/>
       <w:szCs w:val="20"/>
@@ -1752,7 +1713,7 @@
     <w:semiHidden/>
     <w:rsid w:val="00FC693F"/>
     <w:rPr>
-      <w:rFonts w:asciiTheme="majorHAnsi" w:eastAsiaTheme="majorEastAsia" w:hAnsiTheme="majorHAnsi" w:cstheme="majorBidi"/>
+      <w:rFonts w:asciiTheme="majorHAnsi" w:eastAsiaTheme="majorEastAsia" w:hAnsiTheme="majorHAnsi" w:cstheme="majorBidi" w:ascii="Arial" w:hAnsi="Arial"/>
       <w:i/>
       <w:iCs/>
       <w:color w:val="404040" w:themeColor="text1" w:themeTint="BF"/>
@@ -1773,6 +1734,7 @@
       <w:spacing w:line="240" w:lineRule="auto"/>
     </w:pPr>
     <w:rPr>
+      <w:rFonts w:ascii="Arial" w:hAnsi="Arial"/>
       <w:b/>
       <w:bCs/>
       <w:color w:val="4F81BD" w:themeColor="accent1"/>
@@ -1787,6 +1749,7 @@
     <w:qFormat/>
     <w:rsid w:val="00FC693F"/>
     <w:rPr>
+      <w:rFonts w:ascii="Arial" w:hAnsi="Arial"/>
       <w:b/>
       <w:bCs/>
     </w:rPr>
@@ -1798,6 +1761,7 @@
     <w:qFormat/>
     <w:rsid w:val="00FC693F"/>
     <w:rPr>
+      <w:rFonts w:ascii="Arial" w:hAnsi="Arial"/>
       <w:i/>
       <w:iCs/>
     </w:rPr>
@@ -1818,6 +1782,7 @@
       <w:ind w:left="936" w:right="936"/>
     </w:pPr>
     <w:rPr>
+      <w:rFonts w:ascii="Arial" w:hAnsi="Arial"/>
       <w:b/>
       <w:bCs/>
       <w:i/>
@@ -1832,6 +1797,7 @@
     <w:uiPriority w:val="30"/>
     <w:rsid w:val="00FC693F"/>
     <w:rPr>
+      <w:rFonts w:ascii="Arial" w:hAnsi="Arial"/>
       <w:b/>
       <w:bCs/>
       <w:i/>
@@ -1846,6 +1812,7 @@
     <w:qFormat/>
     <w:rsid w:val="00FC693F"/>
     <w:rPr>
+      <w:rFonts w:ascii="Arial" w:hAnsi="Arial"/>
       <w:i/>
       <w:iCs/>
       <w:color w:val="808080" w:themeColor="text1" w:themeTint="7F"/>
@@ -1858,6 +1825,7 @@
     <w:qFormat/>
     <w:rsid w:val="00FC693F"/>
     <w:rPr>
+      <w:rFonts w:ascii="Arial" w:hAnsi="Arial"/>
       <w:b/>
       <w:bCs/>
       <w:i/>
@@ -1872,6 +1840,7 @@
     <w:qFormat/>
     <w:rsid w:val="00FC693F"/>
     <w:rPr>
+      <w:rFonts w:ascii="Arial" w:hAnsi="Arial"/>
       <w:smallCaps/>
       <w:color w:val="C0504D" w:themeColor="accent2"/>
       <w:u w:val="single"/>
@@ -1884,6 +1853,7 @@
     <w:qFormat/>
     <w:rsid w:val="00FC693F"/>
     <w:rPr>
+      <w:rFonts w:ascii="Arial" w:hAnsi="Arial"/>
       <w:b/>
       <w:bCs/>
       <w:smallCaps/>
@@ -1899,6 +1869,7 @@
     <w:qFormat/>
     <w:rsid w:val="00FC693F"/>
     <w:rPr>
+      <w:rFonts w:ascii="Arial" w:hAnsi="Arial"/>
       <w:b/>
       <w:bCs/>
       <w:smallCaps/>
@@ -1917,6 +1888,9 @@
     <w:pPr>
       <w:outlineLvl w:val="9"/>
     </w:pPr>
+    <w:rPr>
+      <w:rFonts w:ascii="Arial" w:hAnsi="Arial"/>
+    </w:rPr>
   </w:style>
   <w:style w:type="table" w:styleId="TableGrid">
     <w:name w:val="Table Grid"/>
@@ -1926,6 +1900,9 @@
     <w:pPr>
       <w:spacing w:after="0" w:line="240" w:lineRule="auto"/>
     </w:pPr>
+    <w:rPr>
+      <w:rFonts w:ascii="Arial" w:hAnsi="Arial"/>
+    </w:rPr>
     <w:tblPr>
       <w:tblInd w:w="0" w:type="dxa"/>
       <w:tblBorders>
@@ -1953,6 +1930,7 @@
       <w:spacing w:after="0" w:line="240" w:lineRule="auto"/>
     </w:pPr>
     <w:rPr>
+      <w:rFonts w:ascii="Arial" w:hAnsi="Arial"/>
       <w:color w:val="000000" w:themeColor="text1" w:themeShade="BF"/>
     </w:rPr>
     <w:tblPr>
@@ -2056,6 +2034,7 @@
       <w:spacing w:after="0" w:line="240" w:lineRule="auto"/>
     </w:pPr>
     <w:rPr>
+      <w:rFonts w:ascii="Arial" w:hAnsi="Arial"/>
       <w:color w:val="365F91" w:themeColor="accent1" w:themeShade="BF"/>
     </w:rPr>
     <w:tblPr>
@@ -2159,6 +2138,7 @@
       <w:spacing w:after="0" w:line="240" w:lineRule="auto"/>
     </w:pPr>
     <w:rPr>
+      <w:rFonts w:ascii="Arial" w:hAnsi="Arial"/>
       <w:color w:val="943634" w:themeColor="accent2" w:themeShade="BF"/>
     </w:rPr>
     <w:tblPr>
@@ -2262,6 +2242,7 @@
       <w:spacing w:after="0" w:line="240" w:lineRule="auto"/>
     </w:pPr>
     <w:rPr>
+      <w:rFonts w:ascii="Arial" w:hAnsi="Arial"/>
       <w:color w:val="76923C" w:themeColor="accent3" w:themeShade="BF"/>
     </w:rPr>
     <w:tblPr>
@@ -2365,6 +2346,7 @@
       <w:spacing w:after="0" w:line="240" w:lineRule="auto"/>
     </w:pPr>
     <w:rPr>
+      <w:rFonts w:ascii="Arial" w:hAnsi="Arial"/>
       <w:color w:val="5F497A" w:themeColor="accent4" w:themeShade="BF"/>
     </w:rPr>
     <w:tblPr>
@@ -2468,6 +2450,7 @@
       <w:spacing w:after="0" w:line="240" w:lineRule="auto"/>
     </w:pPr>
     <w:rPr>
+      <w:rFonts w:ascii="Arial" w:hAnsi="Arial"/>
       <w:color w:val="31849B" w:themeColor="accent5" w:themeShade="BF"/>
     </w:rPr>
     <w:tblPr>
@@ -2571,6 +2554,7 @@
       <w:spacing w:after="0" w:line="240" w:lineRule="auto"/>
     </w:pPr>
     <w:rPr>
+      <w:rFonts w:ascii="Arial" w:hAnsi="Arial"/>
       <w:color w:val="E36C0A" w:themeColor="accent6" w:themeShade="BF"/>
     </w:rPr>
     <w:tblPr>
@@ -2673,6 +2657,9 @@
     <w:pPr>
       <w:spacing w:after="0" w:line="240" w:lineRule="auto"/>
     </w:pPr>
+    <w:rPr>
+      <w:rFonts w:ascii="Arial" w:hAnsi="Arial"/>
+    </w:rPr>
     <w:tblPr>
       <w:tblStyleRowBandSize w:val="1"/>
       <w:tblStyleColBandSize w:val="1"/>
@@ -2765,6 +2752,9 @@
     <w:pPr>
       <w:spacing w:after="0" w:line="240" w:lineRule="auto"/>
     </w:pPr>
+    <w:rPr>
+      <w:rFonts w:ascii="Arial" w:hAnsi="Arial"/>
+    </w:rPr>
     <w:tblPr>
       <w:tblStyleRowBandSize w:val="1"/>
       <w:tblStyleColBandSize w:val="1"/>
@@ -2857,6 +2847,9 @@
     <w:pPr>
       <w:spacing w:after="0" w:line="240" w:lineRule="auto"/>
     </w:pPr>
+    <w:rPr>
+      <w:rFonts w:ascii="Arial" w:hAnsi="Arial"/>
+    </w:rPr>
     <w:tblPr>
       <w:tblStyleRowBandSize w:val="1"/>
       <w:tblStyleColBandSize w:val="1"/>
@@ -2949,6 +2942,9 @@
     <w:pPr>
       <w:spacing w:after="0" w:line="240" w:lineRule="auto"/>
     </w:pPr>
+    <w:rPr>
+      <w:rFonts w:ascii="Arial" w:hAnsi="Arial"/>
+    </w:rPr>
     <w:tblPr>
       <w:tblStyleRowBandSize w:val="1"/>
       <w:tblStyleColBandSize w:val="1"/>
@@ -3041,6 +3037,9 @@
     <w:pPr>
       <w:spacing w:after="0" w:line="240" w:lineRule="auto"/>
     </w:pPr>
+    <w:rPr>
+      <w:rFonts w:ascii="Arial" w:hAnsi="Arial"/>
+    </w:rPr>
     <w:tblPr>
       <w:tblStyleRowBandSize w:val="1"/>
       <w:tblStyleColBandSize w:val="1"/>
@@ -3133,6 +3132,9 @@
     <w:pPr>
       <w:spacing w:after="0" w:line="240" w:lineRule="auto"/>
     </w:pPr>
+    <w:rPr>
+      <w:rFonts w:ascii="Arial" w:hAnsi="Arial"/>
+    </w:rPr>
     <w:tblPr>
       <w:tblStyleRowBandSize w:val="1"/>
       <w:tblStyleColBandSize w:val="1"/>
@@ -3225,6 +3227,9 @@
     <w:pPr>
       <w:spacing w:after="0" w:line="240" w:lineRule="auto"/>
     </w:pPr>
+    <w:rPr>
+      <w:rFonts w:ascii="Arial" w:hAnsi="Arial"/>
+    </w:rPr>
     <w:tblPr>
       <w:tblStyleRowBandSize w:val="1"/>
       <w:tblStyleColBandSize w:val="1"/>
@@ -3317,6 +3322,9 @@
     <w:pPr>
       <w:spacing w:after="0" w:line="240" w:lineRule="auto"/>
     </w:pPr>
+    <w:rPr>
+      <w:rFonts w:ascii="Arial" w:hAnsi="Arial"/>
+    </w:rPr>
     <w:tblPr>
       <w:tblStyleRowBandSize w:val="1"/>
       <w:tblStyleColBandSize w:val="1"/>
@@ -3447,6 +3455,9 @@
     <w:pPr>
       <w:spacing w:after="0" w:line="240" w:lineRule="auto"/>
     </w:pPr>
+    <w:rPr>
+      <w:rFonts w:ascii="Arial" w:hAnsi="Arial"/>
+    </w:rPr>
     <w:tblPr>
       <w:tblStyleRowBandSize w:val="1"/>
       <w:tblStyleColBandSize w:val="1"/>
@@ -3577,6 +3588,9 @@
     <w:pPr>
       <w:spacing w:after="0" w:line="240" w:lineRule="auto"/>
     </w:pPr>
+    <w:rPr>
+      <w:rFonts w:ascii="Arial" w:hAnsi="Arial"/>
+    </w:rPr>
     <w:tblPr>
       <w:tblStyleRowBandSize w:val="1"/>
       <w:tblStyleColBandSize w:val="1"/>
@@ -3707,6 +3721,9 @@
     <w:pPr>
       <w:spacing w:after="0" w:line="240" w:lineRule="auto"/>
     </w:pPr>
+    <w:rPr>
+      <w:rFonts w:ascii="Arial" w:hAnsi="Arial"/>
+    </w:rPr>
     <w:tblPr>
       <w:tblStyleRowBandSize w:val="1"/>
       <w:tblStyleColBandSize w:val="1"/>
@@ -3837,6 +3854,9 @@
     <w:pPr>
       <w:spacing w:after="0" w:line="240" w:lineRule="auto"/>
     </w:pPr>
+    <w:rPr>
+      <w:rFonts w:ascii="Arial" w:hAnsi="Arial"/>
+    </w:rPr>
     <w:tblPr>
       <w:tblStyleRowBandSize w:val="1"/>
       <w:tblStyleColBandSize w:val="1"/>
@@ -3967,6 +3987,9 @@
     <w:pPr>
       <w:spacing w:after="0" w:line="240" w:lineRule="auto"/>
     </w:pPr>
+    <w:rPr>
+      <w:rFonts w:ascii="Arial" w:hAnsi="Arial"/>
+    </w:rPr>
     <w:tblPr>
       <w:tblStyleRowBandSize w:val="1"/>
       <w:tblStyleColBandSize w:val="1"/>
@@ -4097,6 +4120,9 @@
     <w:pPr>
       <w:spacing w:after="0" w:line="240" w:lineRule="auto"/>
     </w:pPr>
+    <w:rPr>
+      <w:rFonts w:ascii="Arial" w:hAnsi="Arial"/>
+    </w:rPr>
     <w:tblPr>
       <w:tblStyleRowBandSize w:val="1"/>
       <w:tblStyleColBandSize w:val="1"/>
@@ -4227,6 +4253,9 @@
     <w:pPr>
       <w:spacing w:after="0" w:line="240" w:lineRule="auto"/>
     </w:pPr>
+    <w:rPr>
+      <w:rFonts w:ascii="Arial" w:hAnsi="Arial"/>
+    </w:rPr>
     <w:tblPr>
       <w:tblStyleRowBandSize w:val="1"/>
       <w:tblStyleColBandSize w:val="1"/>
@@ -4333,6 +4362,9 @@
     <w:pPr>
       <w:spacing w:after="0" w:line="240" w:lineRule="auto"/>
     </w:pPr>
+    <w:rPr>
+      <w:rFonts w:ascii="Arial" w:hAnsi="Arial"/>
+    </w:rPr>
     <w:tblPr>
       <w:tblStyleRowBandSize w:val="1"/>
       <w:tblStyleColBandSize w:val="1"/>
@@ -4439,6 +4471,9 @@
     <w:pPr>
       <w:spacing w:after="0" w:line="240" w:lineRule="auto"/>
     </w:pPr>
+    <w:rPr>
+      <w:rFonts w:ascii="Arial" w:hAnsi="Arial"/>
+    </w:rPr>
     <w:tblPr>
       <w:tblStyleRowBandSize w:val="1"/>
       <w:tblStyleColBandSize w:val="1"/>
@@ -4545,6 +4580,9 @@
     <w:pPr>
       <w:spacing w:after="0" w:line="240" w:lineRule="auto"/>
     </w:pPr>
+    <w:rPr>
+      <w:rFonts w:ascii="Arial" w:hAnsi="Arial"/>
+    </w:rPr>
     <w:tblPr>
       <w:tblStyleRowBandSize w:val="1"/>
       <w:tblStyleColBandSize w:val="1"/>
@@ -4651,6 +4689,9 @@
     <w:pPr>
       <w:spacing w:after="0" w:line="240" w:lineRule="auto"/>
     </w:pPr>
+    <w:rPr>
+      <w:rFonts w:ascii="Arial" w:hAnsi="Arial"/>
+    </w:rPr>
     <w:tblPr>
       <w:tblStyleRowBandSize w:val="1"/>
       <w:tblStyleColBandSize w:val="1"/>
@@ -4757,6 +4798,9 @@
     <w:pPr>
       <w:spacing w:after="0" w:line="240" w:lineRule="auto"/>
     </w:pPr>
+    <w:rPr>
+      <w:rFonts w:ascii="Arial" w:hAnsi="Arial"/>
+    </w:rPr>
     <w:tblPr>
       <w:tblStyleRowBandSize w:val="1"/>
       <w:tblStyleColBandSize w:val="1"/>
@@ -4863,6 +4907,9 @@
     <w:pPr>
       <w:spacing w:after="0" w:line="240" w:lineRule="auto"/>
     </w:pPr>
+    <w:rPr>
+      <w:rFonts w:ascii="Arial" w:hAnsi="Arial"/>
+    </w:rPr>
     <w:tblPr>
       <w:tblStyleRowBandSize w:val="1"/>
       <w:tblStyleColBandSize w:val="1"/>
@@ -4969,6 +5016,9 @@
     <w:pPr>
       <w:spacing w:after="0" w:line="240" w:lineRule="auto"/>
     </w:pPr>
+    <w:rPr>
+      <w:rFonts w:ascii="Arial" w:hAnsi="Arial"/>
+    </w:rPr>
     <w:tblPr>
       <w:tblStyleRowBandSize w:val="1"/>
       <w:tblStyleColBandSize w:val="1"/>
@@ -5118,6 +5168,9 @@
     <w:pPr>
       <w:spacing w:after="0" w:line="240" w:lineRule="auto"/>
     </w:pPr>
+    <w:rPr>
+      <w:rFonts w:ascii="Arial" w:hAnsi="Arial"/>
+    </w:rPr>
     <w:tblPr>
       <w:tblStyleRowBandSize w:val="1"/>
       <w:tblStyleColBandSize w:val="1"/>
@@ -5267,6 +5320,9 @@
     <w:pPr>
       <w:spacing w:after="0" w:line="240" w:lineRule="auto"/>
     </w:pPr>
+    <w:rPr>
+      <w:rFonts w:ascii="Arial" w:hAnsi="Arial"/>
+    </w:rPr>
     <w:tblPr>
       <w:tblStyleRowBandSize w:val="1"/>
       <w:tblStyleColBandSize w:val="1"/>
@@ -5416,6 +5472,9 @@
     <w:pPr>
       <w:spacing w:after="0" w:line="240" w:lineRule="auto"/>
     </w:pPr>
+    <w:rPr>
+      <w:rFonts w:ascii="Arial" w:hAnsi="Arial"/>
+    </w:rPr>
     <w:tblPr>
       <w:tblStyleRowBandSize w:val="1"/>
       <w:tblStyleColBandSize w:val="1"/>
@@ -5565,6 +5624,9 @@
     <w:pPr>
       <w:spacing w:after="0" w:line="240" w:lineRule="auto"/>
     </w:pPr>
+    <w:rPr>
+      <w:rFonts w:ascii="Arial" w:hAnsi="Arial"/>
+    </w:rPr>
     <w:tblPr>
       <w:tblStyleRowBandSize w:val="1"/>
       <w:tblStyleColBandSize w:val="1"/>
@@ -5714,6 +5776,9 @@
     <w:pPr>
       <w:spacing w:after="0" w:line="240" w:lineRule="auto"/>
     </w:pPr>
+    <w:rPr>
+      <w:rFonts w:ascii="Arial" w:hAnsi="Arial"/>
+    </w:rPr>
     <w:tblPr>
       <w:tblStyleRowBandSize w:val="1"/>
       <w:tblStyleColBandSize w:val="1"/>
@@ -5863,6 +5928,9 @@
     <w:pPr>
       <w:spacing w:after="0" w:line="240" w:lineRule="auto"/>
     </w:pPr>
+    <w:rPr>
+      <w:rFonts w:ascii="Arial" w:hAnsi="Arial"/>
+    </w:rPr>
     <w:tblPr>
       <w:tblStyleRowBandSize w:val="1"/>
       <w:tblStyleColBandSize w:val="1"/>
@@ -6013,6 +6081,7 @@
       <w:spacing w:after="0" w:line="240" w:lineRule="auto"/>
     </w:pPr>
     <w:rPr>
+      <w:rFonts w:ascii="Arial" w:hAnsi="Arial"/>
       <w:color w:val="000000" w:themeColor="text1"/>
     </w:rPr>
     <w:tblPr>
@@ -6097,6 +6166,7 @@
       <w:spacing w:after="0" w:line="240" w:lineRule="auto"/>
     </w:pPr>
     <w:rPr>
+      <w:rFonts w:ascii="Arial" w:hAnsi="Arial"/>
       <w:color w:val="000000" w:themeColor="text1"/>
     </w:rPr>
     <w:tblPr>
@@ -6181,6 +6251,7 @@
       <w:spacing w:after="0" w:line="240" w:lineRule="auto"/>
     </w:pPr>
     <w:rPr>
+      <w:rFonts w:ascii="Arial" w:hAnsi="Arial"/>
       <w:color w:val="000000" w:themeColor="text1"/>
     </w:rPr>
     <w:tblPr>
@@ -6265,6 +6336,7 @@
       <w:spacing w:after="0" w:line="240" w:lineRule="auto"/>
     </w:pPr>
     <w:rPr>
+      <w:rFonts w:ascii="Arial" w:hAnsi="Arial"/>
       <w:color w:val="000000" w:themeColor="text1"/>
     </w:rPr>
     <w:tblPr>
@@ -6349,6 +6421,7 @@
       <w:spacing w:after="0" w:line="240" w:lineRule="auto"/>
     </w:pPr>
     <w:rPr>
+      <w:rFonts w:ascii="Arial" w:hAnsi="Arial"/>
       <w:color w:val="000000" w:themeColor="text1"/>
     </w:rPr>
     <w:tblPr>
@@ -6433,6 +6506,7 @@
       <w:spacing w:after="0" w:line="240" w:lineRule="auto"/>
     </w:pPr>
     <w:rPr>
+      <w:rFonts w:ascii="Arial" w:hAnsi="Arial"/>
       <w:color w:val="000000" w:themeColor="text1"/>
     </w:rPr>
     <w:tblPr>
@@ -6517,6 +6591,7 @@
       <w:spacing w:after="0" w:line="240" w:lineRule="auto"/>
     </w:pPr>
     <w:rPr>
+      <w:rFonts w:ascii="Arial" w:hAnsi="Arial"/>
       <w:color w:val="000000" w:themeColor="text1"/>
     </w:rPr>
     <w:tblPr>
@@ -6601,7 +6676,7 @@
       <w:spacing w:after="0" w:line="240" w:lineRule="auto"/>
     </w:pPr>
     <w:rPr>
-      <w:rFonts w:asciiTheme="majorHAnsi" w:eastAsiaTheme="majorEastAsia" w:hAnsiTheme="majorHAnsi" w:cstheme="majorBidi"/>
+      <w:rFonts w:asciiTheme="majorHAnsi" w:eastAsiaTheme="majorEastAsia" w:hAnsiTheme="majorHAnsi" w:cstheme="majorBidi" w:ascii="Arial" w:hAnsi="Arial"/>
       <w:color w:val="000000" w:themeColor="text1"/>
     </w:rPr>
     <w:tblPr>
@@ -6729,7 +6804,7 @@
       <w:spacing w:after="0" w:line="240" w:lineRule="auto"/>
     </w:pPr>
     <w:rPr>
-      <w:rFonts w:asciiTheme="majorHAnsi" w:eastAsiaTheme="majorEastAsia" w:hAnsiTheme="majorHAnsi" w:cstheme="majorBidi"/>
+      <w:rFonts w:asciiTheme="majorHAnsi" w:eastAsiaTheme="majorEastAsia" w:hAnsiTheme="majorHAnsi" w:cstheme="majorBidi" w:ascii="Arial" w:hAnsi="Arial"/>
       <w:color w:val="000000" w:themeColor="text1"/>
     </w:rPr>
     <w:tblPr>
@@ -6857,7 +6932,7 @@
       <w:spacing w:after="0" w:line="240" w:lineRule="auto"/>
     </w:pPr>
     <w:rPr>
-      <w:rFonts w:asciiTheme="majorHAnsi" w:eastAsiaTheme="majorEastAsia" w:hAnsiTheme="majorHAnsi" w:cstheme="majorBidi"/>
+      <w:rFonts w:asciiTheme="majorHAnsi" w:eastAsiaTheme="majorEastAsia" w:hAnsiTheme="majorHAnsi" w:cstheme="majorBidi" w:ascii="Arial" w:hAnsi="Arial"/>
       <w:color w:val="000000" w:themeColor="text1"/>
     </w:rPr>
     <w:tblPr>
@@ -6985,7 +7060,7 @@
       <w:spacing w:after="0" w:line="240" w:lineRule="auto"/>
     </w:pPr>
     <w:rPr>
-      <w:rFonts w:asciiTheme="majorHAnsi" w:eastAsiaTheme="majorEastAsia" w:hAnsiTheme="majorHAnsi" w:cstheme="majorBidi"/>
+      <w:rFonts w:asciiTheme="majorHAnsi" w:eastAsiaTheme="majorEastAsia" w:hAnsiTheme="majorHAnsi" w:cstheme="majorBidi" w:ascii="Arial" w:hAnsi="Arial"/>
       <w:color w:val="000000" w:themeColor="text1"/>
     </w:rPr>
     <w:tblPr>
@@ -7113,7 +7188,7 @@
       <w:spacing w:after="0" w:line="240" w:lineRule="auto"/>
     </w:pPr>
     <w:rPr>
-      <w:rFonts w:asciiTheme="majorHAnsi" w:eastAsiaTheme="majorEastAsia" w:hAnsiTheme="majorHAnsi" w:cstheme="majorBidi"/>
+      <w:rFonts w:asciiTheme="majorHAnsi" w:eastAsiaTheme="majorEastAsia" w:hAnsiTheme="majorHAnsi" w:cstheme="majorBidi" w:ascii="Arial" w:hAnsi="Arial"/>
       <w:color w:val="000000" w:themeColor="text1"/>
     </w:rPr>
     <w:tblPr>
@@ -7241,7 +7316,7 @@
       <w:spacing w:after="0" w:line="240" w:lineRule="auto"/>
     </w:pPr>
     <w:rPr>
-      <w:rFonts w:asciiTheme="majorHAnsi" w:eastAsiaTheme="majorEastAsia" w:hAnsiTheme="majorHAnsi" w:cstheme="majorBidi"/>
+      <w:rFonts w:asciiTheme="majorHAnsi" w:eastAsiaTheme="majorEastAsia" w:hAnsiTheme="majorHAnsi" w:cstheme="majorBidi" w:ascii="Arial" w:hAnsi="Arial"/>
       <w:color w:val="000000" w:themeColor="text1"/>
     </w:rPr>
     <w:tblPr>
@@ -7369,7 +7444,7 @@
       <w:spacing w:after="0" w:line="240" w:lineRule="auto"/>
     </w:pPr>
     <w:rPr>
-      <w:rFonts w:asciiTheme="majorHAnsi" w:eastAsiaTheme="majorEastAsia" w:hAnsiTheme="majorHAnsi" w:cstheme="majorBidi"/>
+      <w:rFonts w:asciiTheme="majorHAnsi" w:eastAsiaTheme="majorEastAsia" w:hAnsiTheme="majorHAnsi" w:cstheme="majorBidi" w:ascii="Arial" w:hAnsi="Arial"/>
       <w:color w:val="000000" w:themeColor="text1"/>
     </w:rPr>
     <w:tblPr>
@@ -7496,6 +7571,9 @@
     <w:pPr>
       <w:spacing w:after="0" w:line="240" w:lineRule="auto"/>
     </w:pPr>
+    <w:rPr>
+      <w:rFonts w:ascii="Arial" w:hAnsi="Arial"/>
+    </w:rPr>
     <w:tblPr>
       <w:tblStyleRowBandSize w:val="1"/>
       <w:tblStyleColBandSize w:val="1"/>
@@ -7569,6 +7647,9 @@
     <w:pPr>
       <w:spacing w:after="0" w:line="240" w:lineRule="auto"/>
     </w:pPr>
+    <w:rPr>
+      <w:rFonts w:ascii="Arial" w:hAnsi="Arial"/>
+    </w:rPr>
     <w:tblPr>
       <w:tblStyleRowBandSize w:val="1"/>
       <w:tblStyleColBandSize w:val="1"/>
@@ -7642,6 +7723,9 @@
     <w:pPr>
       <w:spacing w:after="0" w:line="240" w:lineRule="auto"/>
     </w:pPr>
+    <w:rPr>
+      <w:rFonts w:ascii="Arial" w:hAnsi="Arial"/>
+    </w:rPr>
     <w:tblPr>
       <w:tblStyleRowBandSize w:val="1"/>
       <w:tblStyleColBandSize w:val="1"/>
@@ -7715,6 +7799,9 @@
     <w:pPr>
       <w:spacing w:after="0" w:line="240" w:lineRule="auto"/>
     </w:pPr>
+    <w:rPr>
+      <w:rFonts w:ascii="Arial" w:hAnsi="Arial"/>
+    </w:rPr>
     <w:tblPr>
       <w:tblStyleRowBandSize w:val="1"/>
       <w:tblStyleColBandSize w:val="1"/>
@@ -7788,6 +7875,9 @@
     <w:pPr>
       <w:spacing w:after="0" w:line="240" w:lineRule="auto"/>
     </w:pPr>
+    <w:rPr>
+      <w:rFonts w:ascii="Arial" w:hAnsi="Arial"/>
+    </w:rPr>
     <w:tblPr>
       <w:tblStyleRowBandSize w:val="1"/>
       <w:tblStyleColBandSize w:val="1"/>
@@ -7861,6 +7951,9 @@
     <w:pPr>
       <w:spacing w:after="0" w:line="240" w:lineRule="auto"/>
     </w:pPr>
+    <w:rPr>
+      <w:rFonts w:ascii="Arial" w:hAnsi="Arial"/>
+    </w:rPr>
     <w:tblPr>
       <w:tblStyleRowBandSize w:val="1"/>
       <w:tblStyleColBandSize w:val="1"/>
@@ -7934,6 +8027,9 @@
     <w:pPr>
       <w:spacing w:after="0" w:line="240" w:lineRule="auto"/>
     </w:pPr>
+    <w:rPr>
+      <w:rFonts w:ascii="Arial" w:hAnsi="Arial"/>
+    </w:rPr>
     <w:tblPr>
       <w:tblStyleRowBandSize w:val="1"/>
       <w:tblStyleColBandSize w:val="1"/>
@@ -8008,7 +8104,7 @@
       <w:spacing w:after="0" w:line="240" w:lineRule="auto"/>
     </w:pPr>
     <w:rPr>
-      <w:rFonts w:asciiTheme="majorHAnsi" w:eastAsiaTheme="majorEastAsia" w:hAnsiTheme="majorHAnsi" w:cstheme="majorBidi"/>
+      <w:rFonts w:asciiTheme="majorHAnsi" w:eastAsiaTheme="majorEastAsia" w:hAnsiTheme="majorHAnsi" w:cstheme="majorBidi" w:ascii="Arial" w:hAnsi="Arial"/>
       <w:color w:val="000000" w:themeColor="text1"/>
     </w:rPr>
     <w:tblPr>
@@ -8133,7 +8229,7 @@
       <w:spacing w:after="0" w:line="240" w:lineRule="auto"/>
     </w:pPr>
     <w:rPr>
-      <w:rFonts w:asciiTheme="majorHAnsi" w:eastAsiaTheme="majorEastAsia" w:hAnsiTheme="majorHAnsi" w:cstheme="majorBidi"/>
+      <w:rFonts w:asciiTheme="majorHAnsi" w:eastAsiaTheme="majorEastAsia" w:hAnsiTheme="majorHAnsi" w:cstheme="majorBidi" w:ascii="Arial" w:hAnsi="Arial"/>
       <w:color w:val="000000" w:themeColor="text1"/>
     </w:rPr>
     <w:tblPr>
@@ -8258,7 +8354,7 @@
       <w:spacing w:after="0" w:line="240" w:lineRule="auto"/>
     </w:pPr>
     <w:rPr>
-      <w:rFonts w:asciiTheme="majorHAnsi" w:eastAsiaTheme="majorEastAsia" w:hAnsiTheme="majorHAnsi" w:cstheme="majorBidi"/>
+      <w:rFonts w:asciiTheme="majorHAnsi" w:eastAsiaTheme="majorEastAsia" w:hAnsiTheme="majorHAnsi" w:cstheme="majorBidi" w:ascii="Arial" w:hAnsi="Arial"/>
       <w:color w:val="000000" w:themeColor="text1"/>
     </w:rPr>
     <w:tblPr>
@@ -8383,7 +8479,7 @@
       <w:spacing w:after="0" w:line="240" w:lineRule="auto"/>
     </w:pPr>
     <w:rPr>
-      <w:rFonts w:asciiTheme="majorHAnsi" w:eastAsiaTheme="majorEastAsia" w:hAnsiTheme="majorHAnsi" w:cstheme="majorBidi"/>
+      <w:rFonts w:asciiTheme="majorHAnsi" w:eastAsiaTheme="majorEastAsia" w:hAnsiTheme="majorHAnsi" w:cstheme="majorBidi" w:ascii="Arial" w:hAnsi="Arial"/>
       <w:color w:val="000000" w:themeColor="text1"/>
     </w:rPr>
     <w:tblPr>
@@ -8508,7 +8604,7 @@
       <w:spacing w:after="0" w:line="240" w:lineRule="auto"/>
     </w:pPr>
     <w:rPr>
-      <w:rFonts w:asciiTheme="majorHAnsi" w:eastAsiaTheme="majorEastAsia" w:hAnsiTheme="majorHAnsi" w:cstheme="majorBidi"/>
+      <w:rFonts w:asciiTheme="majorHAnsi" w:eastAsiaTheme="majorEastAsia" w:hAnsiTheme="majorHAnsi" w:cstheme="majorBidi" w:ascii="Arial" w:hAnsi="Arial"/>
       <w:color w:val="000000" w:themeColor="text1"/>
     </w:rPr>
     <w:tblPr>
@@ -8633,7 +8729,7 @@
       <w:spacing w:after="0" w:line="240" w:lineRule="auto"/>
     </w:pPr>
     <w:rPr>
-      <w:rFonts w:asciiTheme="majorHAnsi" w:eastAsiaTheme="majorEastAsia" w:hAnsiTheme="majorHAnsi" w:cstheme="majorBidi"/>
+      <w:rFonts w:asciiTheme="majorHAnsi" w:eastAsiaTheme="majorEastAsia" w:hAnsiTheme="majorHAnsi" w:cstheme="majorBidi" w:ascii="Arial" w:hAnsi="Arial"/>
       <w:color w:val="000000" w:themeColor="text1"/>
     </w:rPr>
     <w:tblPr>
@@ -8758,7 +8854,7 @@
       <w:spacing w:after="0" w:line="240" w:lineRule="auto"/>
     </w:pPr>
     <w:rPr>
-      <w:rFonts w:asciiTheme="majorHAnsi" w:eastAsiaTheme="majorEastAsia" w:hAnsiTheme="majorHAnsi" w:cstheme="majorBidi"/>
+      <w:rFonts w:asciiTheme="majorHAnsi" w:eastAsiaTheme="majorEastAsia" w:hAnsiTheme="majorHAnsi" w:cstheme="majorBidi" w:ascii="Arial" w:hAnsi="Arial"/>
       <w:color w:val="000000" w:themeColor="text1"/>
     </w:rPr>
     <w:tblPr>
@@ -8882,6 +8978,9 @@
     <w:pPr>
       <w:spacing w:after="0" w:line="240" w:lineRule="auto"/>
     </w:pPr>
+    <w:rPr>
+      <w:rFonts w:ascii="Arial" w:hAnsi="Arial"/>
+    </w:rPr>
     <w:tblPr>
       <w:tblStyleRowBandSize w:val="1"/>
       <w:tblStyleColBandSize w:val="1"/>
@@ -9023,6 +9122,9 @@
     <w:pPr>
       <w:spacing w:after="0" w:line="240" w:lineRule="auto"/>
     </w:pPr>
+    <w:rPr>
+      <w:rFonts w:ascii="Arial" w:hAnsi="Arial"/>
+    </w:rPr>
     <w:tblPr>
       <w:tblStyleRowBandSize w:val="1"/>
       <w:tblStyleColBandSize w:val="1"/>
@@ -9164,6 +9266,9 @@
     <w:pPr>
       <w:spacing w:after="0" w:line="240" w:lineRule="auto"/>
     </w:pPr>
+    <w:rPr>
+      <w:rFonts w:ascii="Arial" w:hAnsi="Arial"/>
+    </w:rPr>
     <w:tblPr>
       <w:tblStyleRowBandSize w:val="1"/>
       <w:tblStyleColBandSize w:val="1"/>
@@ -9305,6 +9410,9 @@
     <w:pPr>
       <w:spacing w:after="0" w:line="240" w:lineRule="auto"/>
     </w:pPr>
+    <w:rPr>
+      <w:rFonts w:ascii="Arial" w:hAnsi="Arial"/>
+    </w:rPr>
     <w:tblPr>
       <w:tblStyleRowBandSize w:val="1"/>
       <w:tblStyleColBandSize w:val="1"/>
@@ -9446,6 +9554,9 @@
     <w:pPr>
       <w:spacing w:after="0" w:line="240" w:lineRule="auto"/>
     </w:pPr>
+    <w:rPr>
+      <w:rFonts w:ascii="Arial" w:hAnsi="Arial"/>
+    </w:rPr>
     <w:tblPr>
       <w:tblStyleRowBandSize w:val="1"/>
       <w:tblStyleColBandSize w:val="1"/>
@@ -9587,6 +9698,9 @@
     <w:pPr>
       <w:spacing w:after="0" w:line="240" w:lineRule="auto"/>
     </w:pPr>
+    <w:rPr>
+      <w:rFonts w:ascii="Arial" w:hAnsi="Arial"/>
+    </w:rPr>
     <w:tblPr>
       <w:tblStyleRowBandSize w:val="1"/>
       <w:tblStyleColBandSize w:val="1"/>
@@ -9728,6 +9842,9 @@
     <w:pPr>
       <w:spacing w:after="0" w:line="240" w:lineRule="auto"/>
     </w:pPr>
+    <w:rPr>
+      <w:rFonts w:ascii="Arial" w:hAnsi="Arial"/>
+    </w:rPr>
     <w:tblPr>
       <w:tblStyleRowBandSize w:val="1"/>
       <w:tblStyleColBandSize w:val="1"/>
@@ -9870,6 +9987,7 @@
       <w:spacing w:after="0" w:line="240" w:lineRule="auto"/>
     </w:pPr>
     <w:rPr>
+      <w:rFonts w:ascii="Arial" w:hAnsi="Arial"/>
       <w:color w:val="FFFFFF" w:themeColor="background1"/>
     </w:rPr>
     <w:tblPr>
@@ -9984,6 +10102,7 @@
       <w:spacing w:after="0" w:line="240" w:lineRule="auto"/>
     </w:pPr>
     <w:rPr>
+      <w:rFonts w:ascii="Arial" w:hAnsi="Arial"/>
       <w:color w:val="FFFFFF" w:themeColor="background1"/>
     </w:rPr>
     <w:tblPr>
@@ -10098,6 +10217,7 @@
       <w:spacing w:after="0" w:line="240" w:lineRule="auto"/>
     </w:pPr>
     <w:rPr>
+      <w:rFonts w:ascii="Arial" w:hAnsi="Arial"/>
       <w:color w:val="FFFFFF" w:themeColor="background1"/>
     </w:rPr>
     <w:tblPr>
@@ -10212,6 +10332,7 @@
       <w:spacing w:after="0" w:line="240" w:lineRule="auto"/>
     </w:pPr>
     <w:rPr>
+      <w:rFonts w:ascii="Arial" w:hAnsi="Arial"/>
       <w:color w:val="FFFFFF" w:themeColor="background1"/>
     </w:rPr>
     <w:tblPr>
@@ -10326,6 +10447,7 @@
       <w:spacing w:after="0" w:line="240" w:lineRule="auto"/>
     </w:pPr>
     <w:rPr>
+      <w:rFonts w:ascii="Arial" w:hAnsi="Arial"/>
       <w:color w:val="FFFFFF" w:themeColor="background1"/>
     </w:rPr>
     <w:tblPr>
@@ -10440,6 +10562,7 @@
       <w:spacing w:after="0" w:line="240" w:lineRule="auto"/>
     </w:pPr>
     <w:rPr>
+      <w:rFonts w:ascii="Arial" w:hAnsi="Arial"/>
       <w:color w:val="FFFFFF" w:themeColor="background1"/>
     </w:rPr>
     <w:tblPr>
@@ -10554,6 +10677,7 @@
       <w:spacing w:after="0" w:line="240" w:lineRule="auto"/>
     </w:pPr>
     <w:rPr>
+      <w:rFonts w:ascii="Arial" w:hAnsi="Arial"/>
       <w:color w:val="FFFFFF" w:themeColor="background1"/>
     </w:rPr>
     <w:tblPr>
@@ -10668,6 +10792,7 @@
       <w:spacing w:after="0" w:line="240" w:lineRule="auto"/>
     </w:pPr>
     <w:rPr>
+      <w:rFonts w:ascii="Arial" w:hAnsi="Arial"/>
       <w:color w:val="000000" w:themeColor="text1"/>
     </w:rPr>
     <w:tblPr>
@@ -10790,6 +10915,7 @@
       <w:spacing w:after="0" w:line="240" w:lineRule="auto"/>
     </w:pPr>
     <w:rPr>
+      <w:rFonts w:ascii="Arial" w:hAnsi="Arial"/>
       <w:color w:val="000000" w:themeColor="text1"/>
     </w:rPr>
     <w:tblPr>
@@ -10912,6 +11038,7 @@
       <w:spacing w:after="0" w:line="240" w:lineRule="auto"/>
     </w:pPr>
     <w:rPr>
+      <w:rFonts w:ascii="Arial" w:hAnsi="Arial"/>
       <w:color w:val="000000" w:themeColor="text1"/>
     </w:rPr>
     <w:tblPr>
@@ -11034,6 +11161,7 @@
       <w:spacing w:after="0" w:line="240" w:lineRule="auto"/>
     </w:pPr>
     <w:rPr>
+      <w:rFonts w:ascii="Arial" w:hAnsi="Arial"/>
       <w:color w:val="000000" w:themeColor="text1"/>
     </w:rPr>
     <w:tblPr>
@@ -11146,6 +11274,7 @@
       <w:spacing w:after="0" w:line="240" w:lineRule="auto"/>
     </w:pPr>
     <w:rPr>
+      <w:rFonts w:ascii="Arial" w:hAnsi="Arial"/>
       <w:color w:val="000000" w:themeColor="text1"/>
     </w:rPr>
     <w:tblPr>
@@ -11268,6 +11397,7 @@
       <w:spacing w:after="0" w:line="240" w:lineRule="auto"/>
     </w:pPr>
     <w:rPr>
+      <w:rFonts w:ascii="Arial" w:hAnsi="Arial"/>
       <w:color w:val="000000" w:themeColor="text1"/>
     </w:rPr>
     <w:tblPr>
@@ -11390,6 +11520,7 @@
       <w:spacing w:after="0" w:line="240" w:lineRule="auto"/>
     </w:pPr>
     <w:rPr>
+      <w:rFonts w:ascii="Arial" w:hAnsi="Arial"/>
       <w:color w:val="000000" w:themeColor="text1"/>
     </w:rPr>
     <w:tblPr>
@@ -11512,6 +11643,7 @@
       <w:spacing w:after="0" w:line="240" w:lineRule="auto"/>
     </w:pPr>
     <w:rPr>
+      <w:rFonts w:ascii="Arial" w:hAnsi="Arial"/>
       <w:color w:val="000000" w:themeColor="text1"/>
     </w:rPr>
     <w:tblPr>
@@ -11598,6 +11730,7 @@
       <w:spacing w:after="0" w:line="240" w:lineRule="auto"/>
     </w:pPr>
     <w:rPr>
+      <w:rFonts w:ascii="Arial" w:hAnsi="Arial"/>
       <w:color w:val="000000" w:themeColor="text1"/>
     </w:rPr>
     <w:tblPr>
@@ -11684,6 +11817,7 @@
       <w:spacing w:after="0" w:line="240" w:lineRule="auto"/>
     </w:pPr>
     <w:rPr>
+      <w:rFonts w:ascii="Arial" w:hAnsi="Arial"/>
       <w:color w:val="000000" w:themeColor="text1"/>
     </w:rPr>
     <w:tblPr>
@@ -11770,6 +11904,7 @@
       <w:spacing w:after="0" w:line="240" w:lineRule="auto"/>
     </w:pPr>
     <w:rPr>
+      <w:rFonts w:ascii="Arial" w:hAnsi="Arial"/>
       <w:color w:val="000000" w:themeColor="text1"/>
     </w:rPr>
     <w:tblPr>
@@ -11856,6 +11991,7 @@
       <w:spacing w:after="0" w:line="240" w:lineRule="auto"/>
     </w:pPr>
     <w:rPr>
+      <w:rFonts w:ascii="Arial" w:hAnsi="Arial"/>
       <w:color w:val="000000" w:themeColor="text1"/>
     </w:rPr>
     <w:tblPr>
@@ -11942,6 +12078,7 @@
       <w:spacing w:after="0" w:line="240" w:lineRule="auto"/>
     </w:pPr>
     <w:rPr>
+      <w:rFonts w:ascii="Arial" w:hAnsi="Arial"/>
       <w:color w:val="000000" w:themeColor="text1"/>
     </w:rPr>
     <w:tblPr>
@@ -12028,6 +12165,7 @@
       <w:spacing w:after="0" w:line="240" w:lineRule="auto"/>
     </w:pPr>
     <w:rPr>
+      <w:rFonts w:ascii="Arial" w:hAnsi="Arial"/>
       <w:color w:val="000000" w:themeColor="text1"/>
     </w:rPr>
     <w:tblPr>
@@ -12114,6 +12252,7 @@
       <w:spacing w:after="0" w:line="240" w:lineRule="auto"/>
     </w:pPr>
     <w:rPr>
+      <w:rFonts w:ascii="Arial" w:hAnsi="Arial"/>
       <w:color w:val="000000" w:themeColor="text1"/>
     </w:rPr>
     <w:tblPr>
@@ -12194,6 +12333,7 @@
       <w:spacing w:after="0" w:line="240" w:lineRule="auto"/>
     </w:pPr>
     <w:rPr>
+      <w:rFonts w:ascii="Arial" w:hAnsi="Arial"/>
       <w:color w:val="000000" w:themeColor="text1"/>
     </w:rPr>
     <w:tblPr>
@@ -12274,6 +12414,7 @@
       <w:spacing w:after="0" w:line="240" w:lineRule="auto"/>
     </w:pPr>
     <w:rPr>
+      <w:rFonts w:ascii="Arial" w:hAnsi="Arial"/>
       <w:color w:val="000000" w:themeColor="text1"/>
     </w:rPr>
     <w:tblPr>
@@ -12354,6 +12495,7 @@
       <w:spacing w:after="0" w:line="240" w:lineRule="auto"/>
     </w:pPr>
     <w:rPr>
+      <w:rFonts w:ascii="Arial" w:hAnsi="Arial"/>
       <w:color w:val="000000" w:themeColor="text1"/>
     </w:rPr>
     <w:tblPr>
@@ -12434,6 +12576,7 @@
       <w:spacing w:after="0" w:line="240" w:lineRule="auto"/>
     </w:pPr>
     <w:rPr>
+      <w:rFonts w:ascii="Arial" w:hAnsi="Arial"/>
       <w:color w:val="000000" w:themeColor="text1"/>
     </w:rPr>
     <w:tblPr>
@@ -12514,6 +12657,7 @@
       <w:spacing w:after="0" w:line="240" w:lineRule="auto"/>
     </w:pPr>
     <w:rPr>
+      <w:rFonts w:ascii="Arial" w:hAnsi="Arial"/>
       <w:color w:val="000000" w:themeColor="text1"/>
     </w:rPr>
     <w:tblPr>
@@ -12594,6 +12738,7 @@
       <w:spacing w:after="0" w:line="240" w:lineRule="auto"/>
     </w:pPr>
     <w:rPr>
+      <w:rFonts w:ascii="Arial" w:hAnsi="Arial"/>
       <w:color w:val="000000" w:themeColor="text1"/>
     </w:rPr>
     <w:tblPr>
@@ -12669,13 +12814,13 @@
     <w:name w:val="Role"/>
     <w:pPr>
       <w:keepNext/>
-      <w:spacing w:before="100" w:after="20"/>
-    </w:pPr>
-    <w:rPr>
-      <w:rFonts w:ascii="Aptos" w:hAnsi="Aptos"/>
+      <w:spacing w:before="130" w:after="30"/>
+    </w:pPr>
+    <w:rPr>
+      <w:rFonts w:ascii="Arial" w:hAnsi="Arial"/>
       <w:b/>
       <w:color w:val="000000"/>
-      <w:sz w:val="20"/>
+      <w:sz w:val="21"/>
     </w:rPr>
   </w:style>
 </w:styles>

</xml_diff>

<commit_message>
Add positioning summaries to both CVs
</commit_message>
<xml_diff>
--- a/output/docx/Ekaterina_Melnikova_Product_Designer.docx
+++ b/output/docx/Ekaterina_Melnikova_Product_Designer.docx
@@ -92,6 +92,22 @@
           <w:t>Portfolio</w:t>
         </w:r>
       </w:hyperlink>
+    </w:p>
+    <w:p>
+      <w:pPr>
+        <w:keepNext/>
+        <w:spacing w:before="0" w:after="0" w:line="259" w:lineRule="auto"/>
+      </w:pPr>
+      <w:r>
+        <w:rPr>
+          <w:rFonts w:ascii="Arial" w:hAnsi="Arial"/>
+          <w:b w:val="0"/>
+          <w:i w:val="0"/>
+          <w:color w:val="000000"/>
+          <w:sz w:val="20"/>
+        </w:rPr>
+        <w:t>Product Designer focused on B2B SaaS, complex admin tools and mobile products. I turn user research and business goals into clear workflows, validate solutions through usability testing, and work with product and engineering teams from discovery to delivery.</w:t>
+      </w:r>
     </w:p>
     <w:p>
       <w:pPr>

</xml_diff>